<commit_message>
feat: complete pre-launch hardening, CEFR A2-B1 quiz recalibration, and sterile reset
</commit_message>
<xml_diff>
--- a/public/templates/template_surat_peminjaman.docx
+++ b/public/templates/template_surat_peminjaman.docx
@@ -1283,19 +1283,13 @@
       </w:r>
     </w:p>
     <w:p>
-      <w:pPr>
-        <w:pBdr>
-          <w:top w:space="0" w:sz="0" w:val="nil"/>
-          <w:left w:space="0" w:sz="0" w:val="nil"/>
-          <w:bottom w:space="0" w:sz="0" w:val="nil"/>
-          <w:right w:space="0" w:sz="0" w:val="nil"/>
-          <w:between w:space="0" w:sz="0" w:val="nil"/>
-        </w:pBdr>
-        <w:tabs>
-          <w:tab w:val="left" w:leader="none" w:pos="6480"/>
-        </w:tabs>
+      <w:r>
+        <w:t>{#is_single_pembina}</w:t>
+      </w:r>
+    </w:p>
+    <w:p>
+      <w:pPr>
         <w:spacing w:before="14" w:lineRule="auto"/>
-        <w:ind w:right="372"/>
         <w:jc w:val="center"/>
         <w:rPr>
           <w:color w:val="000000"/>
@@ -1308,113 +1302,54 @@
           <w:color w:val="000000"/>
           <w:sz w:val="24"/>
           <w:szCs w:val="24"/>
-          <w:rtl w:val="0"/>
-        </w:rPr>
-        <w:t xml:space="preserve">Pembina ENGLISH CLUB</w:t>
-      </w:r>
-    </w:p>
-    <w:p>
-      <w:pPr>
-        <w:pBdr>
-          <w:top w:space="0" w:sz="0" w:val="nil"/>
-          <w:left w:space="0" w:sz="0" w:val="nil"/>
-          <w:bottom w:space="0" w:sz="0" w:val="nil"/>
-          <w:right w:space="0" w:sz="0" w:val="nil"/>
-          <w:between w:space="0" w:sz="0" w:val="nil"/>
-        </w:pBdr>
+        </w:rPr>
+        <w:t>{jabatan_pembina}</w:t>
+      </w:r>
+    </w:p>
+    <w:p>
+      <w:pPr>
         <w:spacing w:before="11" w:lineRule="auto"/>
         <w:jc w:val="center"/>
         <w:rPr>
-          <w:color w:val="000000"/>
-          <w:sz w:val="29"/>
-          <w:szCs w:val="29"/>
-        </w:rPr>
-      </w:pPr>
-      <w:r>
-        <w:rPr>
-          <w:rtl w:val="0"/>
-        </w:rPr>
-      </w:r>
-    </w:p>
-    <w:p>
-      <w:pPr>
-        <w:pBdr>
-          <w:top w:space="0" w:sz="0" w:val="nil"/>
-          <w:left w:space="0" w:sz="0" w:val="nil"/>
-          <w:bottom w:space="0" w:sz="0" w:val="nil"/>
-          <w:right w:space="0" w:sz="0" w:val="nil"/>
-          <w:between w:space="0" w:sz="0" w:val="nil"/>
-        </w:pBdr>
+          <w:sz w:val="28"/>
+          <w:szCs w:val="28"/>
+        </w:rPr>
+      </w:pPr>
+    </w:p>
+    <w:p>
+      <w:pPr>
         <w:spacing w:before="11" w:lineRule="auto"/>
         <w:jc w:val="center"/>
         <w:rPr>
-          <w:color w:val="000000"/>
-          <w:sz w:val="29"/>
-          <w:szCs w:val="29"/>
-        </w:rPr>
-      </w:pPr>
-      <w:r>
-        <w:rPr>
-          <w:rtl w:val="0"/>
-        </w:rPr>
-      </w:r>
-    </w:p>
-    <w:p>
-      <w:pPr>
-        <w:pBdr>
-          <w:top w:space="0" w:sz="0" w:val="nil"/>
-          <w:left w:space="0" w:sz="0" w:val="nil"/>
-          <w:bottom w:space="0" w:sz="0" w:val="nil"/>
-          <w:right w:space="0" w:sz="0" w:val="nil"/>
-          <w:between w:space="0" w:sz="0" w:val="nil"/>
-        </w:pBdr>
+          <w:sz w:val="28"/>
+          <w:szCs w:val="28"/>
+        </w:rPr>
+      </w:pPr>
+    </w:p>
+    <w:p>
+      <w:pPr>
         <w:spacing w:before="11" w:lineRule="auto"/>
         <w:jc w:val="center"/>
         <w:rPr>
-          <w:color w:val="000000"/>
-          <w:sz w:val="29"/>
-          <w:szCs w:val="29"/>
-        </w:rPr>
-      </w:pPr>
-      <w:r>
-        <w:rPr>
-          <w:rtl w:val="0"/>
-        </w:rPr>
-      </w:r>
-    </w:p>
-    <w:p>
-      <w:pPr>
-        <w:pBdr>
-          <w:top w:space="0" w:sz="0" w:val="nil"/>
-          <w:left w:space="0" w:sz="0" w:val="nil"/>
-          <w:bottom w:space="0" w:sz="0" w:val="nil"/>
-          <w:right w:space="0" w:sz="0" w:val="nil"/>
-          <w:between w:space="0" w:sz="0" w:val="nil"/>
-        </w:pBdr>
+          <w:sz w:val="28"/>
+          <w:szCs w:val="28"/>
+        </w:rPr>
+      </w:pPr>
+    </w:p>
+    <w:p>
+      <w:pPr>
         <w:spacing w:before="11" w:lineRule="auto"/>
         <w:jc w:val="center"/>
         <w:rPr>
-          <w:color w:val="000000"/>
-          <w:sz w:val="29"/>
-          <w:szCs w:val="29"/>
-        </w:rPr>
-      </w:pPr>
-      <w:r>
-        <w:rPr>
-          <w:rtl w:val="0"/>
-        </w:rPr>
-      </w:r>
-    </w:p>
-    <w:p>
-      <w:pPr>
-        <w:pBdr>
-          <w:top w:space="0" w:sz="0" w:val="nil"/>
-          <w:left w:space="0" w:sz="0" w:val="nil"/>
-          <w:bottom w:space="0" w:sz="0" w:val="nil"/>
-          <w:right w:space="0" w:sz="0" w:val="nil"/>
-          <w:between w:space="0" w:sz="0" w:val="nil"/>
-        </w:pBdr>
-        <w:ind w:left="2880" w:firstLine="0"/>
+          <w:sz w:val="28"/>
+          <w:szCs w:val="28"/>
+        </w:rPr>
+      </w:pPr>
+    </w:p>
+    <w:p>
+      <w:pPr>
+        <w:spacing w:before="14" w:lineRule="auto"/>
+        <w:jc w:val="center"/>
         <w:rPr>
           <w:b w:val="1"/>
           <w:bCs w:val="1"/>
@@ -1431,51 +1366,213 @@
           <w:color w:val="000000"/>
           <w:sz w:val="24"/>
           <w:szCs w:val="24"/>
-          <w:rtl w:val="0"/>
-        </w:rPr>
-        <w:t xml:space="preserve">        Nanang Cahyana</w:t>
-      </w:r>
-      <w:r>
-        <w:rPr>
-          <w:b w:val="1"/>
-          <w:bCs w:val="1"/>
-          <w:sz w:val="24"/>
-          <w:szCs w:val="24"/>
           <w:u w:val="single"/>
-          <w:rtl w:val="0"/>
-        </w:rPr>
-        <w:t xml:space="preserve"> S.pd. Ing</w:t>
-      </w:r>
-      <w:r>
-        <w:rPr>
-          <w:rtl w:val="0"/>
-        </w:rPr>
-      </w:r>
-    </w:p>
-    <w:p>
-      <w:pPr>
-        <w:pBdr>
-          <w:top w:space="0" w:sz="0" w:val="nil"/>
-          <w:left w:space="0" w:sz="0" w:val="nil"/>
-          <w:bottom w:space="0" w:sz="0" w:val="nil"/>
-          <w:right w:space="0" w:sz="0" w:val="nil"/>
-          <w:between w:space="0" w:sz="0" w:val="nil"/>
-        </w:pBdr>
-        <w:ind w:left="2824" w:firstLine="56.00000000000023"/>
-        <w:rPr>
-          <w:color w:val="000000"/>
-          <w:sz w:val="24"/>
-          <w:szCs w:val="24"/>
-        </w:rPr>
-      </w:pPr>
-      <w:r>
-        <w:rPr>
-          <w:color w:val="000000"/>
-          <w:sz w:val="24"/>
-          <w:szCs w:val="24"/>
-          <w:rtl w:val="0"/>
-        </w:rPr>
-        <w:t xml:space="preserve">        NIP. 198603172023211003</w:t>
+        </w:rPr>
+        <w:t>{nama_pembina}</w:t>
+      </w:r>
+    </w:p>
+    <w:p>
+      <w:pPr>
+        <w:spacing w:before="14" w:lineRule="auto"/>
+        <w:jc w:val="center"/>
+        <w:rPr>
+          <w:color w:val="000000"/>
+          <w:sz w:val="24"/>
+          <w:szCs w:val="24"/>
+        </w:rPr>
+      </w:pPr>
+      <w:r>
+        <w:rPr>
+          <w:color w:val="000000"/>
+          <w:sz w:val="24"/>
+          <w:szCs w:val="24"/>
+        </w:rPr>
+        <w:t>{nip_pembina}</w:t>
+      </w:r>
+    </w:p>
+    <w:p>
+      <w:r>
+        <w:t>{/is_single_pembina}</w:t>
+      </w:r>
+    </w:p>
+    <w:p>
+      <w:r>
+        <w:t>{#is_dual_pembina}</w:t>
+      </w:r>
+    </w:p>
+    <w:tbl>
+      <w:tblPr>
+        <w:tblW w:w="9000" w:type="dxa"/>
+        <w:jc w:val="center"/>
+        <w:tblBorders>
+          <w:top w:val="none" w:sz="0" w:space="0" w:color="auto"/>
+          <w:left w:val="none" w:sz="0" w:space="0" w:color="auto"/>
+          <w:bottom w:val="none" w:sz="0" w:space="0" w:color="auto"/>
+          <w:right w:val="none" w:sz="0" w:space="0" w:color="auto"/>
+          <w:insideH w:val="none" w:sz="0" w:space="0" w:color="auto"/>
+          <w:insideV w:val="none" w:sz="0" w:space="0" w:color="auto"/>
+        </w:tblBorders>
+      </w:tblPr>
+      <w:tblGrid>
+        <w:gridCol w:w="4500"/>
+        <w:gridCol w:w="4500"/>
+      </w:tblGrid>
+      <w:tr>
+        <w:tc>
+          <w:tcPr>
+            <w:tcW w:w="4500" w:type="dxa"/>
+          </w:tcPr>
+          <w:p>
+            <w:pPr>
+              <w:jc w:val="center"/>
+              <w:rPr>
+                <w:sz w:val="24"/>
+              </w:rPr>
+            </w:pPr>
+            <w:r>
+              <w:rPr>
+                <w:sz w:val="24"/>
+              </w:rPr>
+              <w:t>Pembina I</w:t>
+            </w:r>
+          </w:p>
+          <w:p>
+            <w:pPr>
+              <w:spacing w:before="10"/>
+              <w:jc w:val="center"/>
+            </w:pPr>
+          </w:p>
+          <w:p>
+            <w:pPr>
+              <w:spacing w:before="10"/>
+              <w:jc w:val="center"/>
+            </w:pPr>
+          </w:p>
+          <w:p>
+            <w:pPr>
+              <w:spacing w:before="10"/>
+              <w:jc w:val="center"/>
+            </w:pPr>
+          </w:p>
+          <w:p>
+            <w:pPr>
+              <w:spacing w:before="10"/>
+              <w:jc w:val="center"/>
+            </w:pPr>
+          </w:p>
+          <w:p>
+            <w:pPr>
+              <w:jc w:val="center"/>
+              <w:rPr>
+                <w:b/>
+                <w:u w:val="single"/>
+                <w:sz w:val="24"/>
+              </w:rPr>
+            </w:pPr>
+            <w:r>
+              <w:rPr>
+                <w:b/>
+                <w:u w:val="single"/>
+                <w:sz w:val="24"/>
+              </w:rPr>
+              <w:t>{nama_pembina_1}</w:t>
+            </w:r>
+          </w:p>
+          <w:p>
+            <w:pPr>
+              <w:jc w:val="center"/>
+              <w:rPr>
+                <w:sz w:val="24"/>
+              </w:rPr>
+            </w:pPr>
+            <w:r>
+              <w:rPr>
+                <w:sz w:val="24"/>
+              </w:rPr>
+              <w:t>{nip_pembina_1}</w:t>
+            </w:r>
+          </w:p>
+        </w:tc>
+        <w:tc>
+          <w:tcPr>
+            <w:tcW w:w="4500" w:type="dxa"/>
+          </w:tcPr>
+          <w:p>
+            <w:pPr>
+              <w:jc w:val="center"/>
+              <w:rPr>
+                <w:sz w:val="24"/>
+              </w:rPr>
+            </w:pPr>
+            <w:r>
+              <w:rPr>
+                <w:sz w:val="24"/>
+              </w:rPr>
+              <w:t>Pembina II</w:t>
+            </w:r>
+          </w:p>
+          <w:p>
+            <w:pPr>
+              <w:spacing w:before="10"/>
+              <w:jc w:val="center"/>
+            </w:pPr>
+          </w:p>
+          <w:p>
+            <w:pPr>
+              <w:spacing w:before="10"/>
+              <w:jc w:val="center"/>
+            </w:pPr>
+          </w:p>
+          <w:p>
+            <w:pPr>
+              <w:spacing w:before="10"/>
+              <w:jc w:val="center"/>
+            </w:pPr>
+          </w:p>
+          <w:p>
+            <w:pPr>
+              <w:spacing w:before="10"/>
+              <w:jc w:val="center"/>
+            </w:pPr>
+          </w:p>
+          <w:p>
+            <w:pPr>
+              <w:jc w:val="center"/>
+              <w:rPr>
+                <w:b/>
+                <w:u w:val="single"/>
+                <w:sz w:val="24"/>
+              </w:rPr>
+            </w:pPr>
+            <w:r>
+              <w:rPr>
+                <w:b/>
+                <w:u w:val="single"/>
+                <w:sz w:val="24"/>
+              </w:rPr>
+              <w:t>{nama_pembina_2}</w:t>
+            </w:r>
+          </w:p>
+          <w:p>
+            <w:pPr>
+              <w:jc w:val="center"/>
+              <w:rPr>
+                <w:sz w:val="24"/>
+              </w:rPr>
+            </w:pPr>
+            <w:r>
+              <w:rPr>
+                <w:sz w:val="24"/>
+              </w:rPr>
+              <w:t>{nip_pembina_2}</w:t>
+            </w:r>
+          </w:p>
+        </w:tc>
+      </w:tr>
+    </w:tbl>
+    <w:p>
+      <w:r>
+        <w:t>{/is_dual_pembina}</w:t>
       </w:r>
     </w:p>
     <w:p>

</xml_diff>